<commit_message>
docs(submission): rewrite script to walk audience through what's on each slide
Now that the deck embeds code blocks, ASCII diagrams, and 10
screenshots, the script's "Say." text needed to actually point at what
the audience can see. Each of the 18 slide blocks is rewritten to:

- Reference the visible code line by line ("read line two and three",
  "the bottom snippet is the index"), so the speaker walks the
  audience through the slide rather than reciting a parallel monologue.
- Restate every "On screen." section to match the actual deck
  contents (bullets, code blocks, and screenshots).
- Stay conversational rather than slide-bullet-shaped — the spoken
  paragraphs read like a real walkthrough, not narration.
- Sync ground truth: 63 tests (was 62), seven bugs (was six).

Regenerates the Word version of the script. Deck contents and counts
are unchanged; only the speaker text is updated.
</commit_message>
<xml_diff>
--- a/submission/Makuvaza_Tanaka_Vibzcheck_Project2_Presentation_Script.docx
+++ b/submission/Makuvaza_Tanaka_Vibzcheck_Project2_Presentation_Script.docx
@@ -202,7 +202,7 @@
           <w:color w:val="333333"/>
           <w:sz w:val="20"/>
         </w:rPr>
-        <w:t>+62 All tests passed!</w:t>
+        <w:t>+63 All tests passed!</w:t>
       </w:r>
       <w:r>
         <w:rPr>
@@ -293,7 +293,25 @@
         <w:t>On screen.</w:t>
       </w:r>
       <w:r>
-        <w:t xml:space="preserve"> Both emulators, side by side. Live app.</w:t>
+        <w:t xml:space="preserve"> Both emulators side by side, plus two real captures of the same session viewed from each phone. Look at E85 — Device A shows </w:t>
+      </w:r>
+      <w:r>
+        <w:rPr>
+          <w:b/>
+        </w:rPr>
+        <w:t>1 upvote</w:t>
+      </w:r>
+      <w:r>
+        <w:t xml:space="preserve">, Device B shows </w:t>
+      </w:r>
+      <w:r>
+        <w:rPr>
+          <w:b/>
+        </w:rPr>
+        <w:t>2</w:t>
+      </w:r>
+      <w:r>
+        <w:t xml:space="preserve"> after the joiner upvotes. That one-vote difference is the realtime-sync proof I'm about to recreate live.</w:t>
       </w:r>
     </w:p>
     <w:p>
@@ -440,7 +458,7 @@
         <w:rPr>
           <w:i/>
         </w:rPr>
-        <w:t>Notice nothing here is polled. That's a Firestore stream listener on the queue subcollection. The vote tap on Bob's device is a transaction so even if Alice voted at the same instant, neither one overwrites the other.</w:t>
+        <w:t>The two screenshots on the right are the static version of what you're seeing live: same session, two phones, vote count drifts apart for a moment and then catches up. Nothing here is polled. That's a Firestore stream listener on the queue subcollection. The vote tap on Bob's device is a transaction, so even if Alice voted at the same instant, neither one overwrites the other.</w:t>
       </w:r>
     </w:p>
     <w:p>
@@ -456,7 +474,7 @@
         <w:pStyle w:val="Heading3"/>
       </w:pPr>
       <w:r>
-        <w:t>Slide 3 — Stack at a glance (02:30 - 03:00, ~30 s)</w:t>
+        <w:t>Slide 3 — What I built it with (02:30 - 03:00, ~30 s)</w:t>
       </w:r>
     </w:p>
     <w:p>
@@ -467,345 +485,9 @@
         <w:t>On screen.</w:t>
       </w:r>
       <w:r>
-        <w:t xml:space="preserve"> Single table:</w:t>
+        <w:t xml:space="preserve"> A bullet list mapping each piece of the stack to the job it actually does for the user — Flutter for the cross-platform app, Riverpod for state, go_router for navigation, the four required Firebase services (Auth, Firestore, Storage, Cloud Messaging) for identity, live data, avatars, and pushes, and Cloud Functions so the Spotify Client Secret never ships in the APK.</w:t>
       </w:r>
     </w:p>
-    <w:tbl>
-      <w:tblPr>
-        <w:tblStyle w:val="LightGrid-Accent1"/>
-        <w:tblW w:type="auto" w:w="0"/>
-        <w:tblLook w:firstColumn="1" w:firstRow="1" w:lastColumn="0" w:lastRow="0" w:noHBand="0" w:noVBand="1" w:val="04A0"/>
-      </w:tblPr>
-      <w:tblGrid>
-        <w:gridCol w:w="2880"/>
-        <w:gridCol w:w="2880"/>
-        <w:gridCol w:w="2880"/>
-      </w:tblGrid>
-      <w:tr>
-        <w:tc>
-          <w:tcPr>
-            <w:tcW w:type="dxa" w:w="2880"/>
-          </w:tcPr>
-          <w:p>
-            <w:r/>
-            <w:r>
-              <w:rPr>
-                <w:b/>
-              </w:rPr>
-              <w:t>Layer</w:t>
-            </w:r>
-          </w:p>
-        </w:tc>
-        <w:tc>
-          <w:tcPr>
-            <w:tcW w:type="dxa" w:w="2880"/>
-          </w:tcPr>
-          <w:p>
-            <w:r/>
-            <w:r>
-              <w:rPr>
-                <w:b/>
-              </w:rPr>
-              <w:t>Choice</w:t>
-            </w:r>
-          </w:p>
-        </w:tc>
-        <w:tc>
-          <w:tcPr>
-            <w:tcW w:type="dxa" w:w="2880"/>
-          </w:tcPr>
-          <w:p>
-            <w:r/>
-            <w:r>
-              <w:rPr>
-                <w:b/>
-              </w:rPr>
-              <w:t>Why</w:t>
-            </w:r>
-          </w:p>
-        </w:tc>
-      </w:tr>
-      <w:tr>
-        <w:tc>
-          <w:tcPr>
-            <w:tcW w:type="dxa" w:w="2880"/>
-          </w:tcPr>
-          <w:p>
-            <w:r/>
-            <w:r>
-              <w:t>Mobile</w:t>
-            </w:r>
-          </w:p>
-        </w:tc>
-        <w:tc>
-          <w:tcPr>
-            <w:tcW w:type="dxa" w:w="2880"/>
-          </w:tcPr>
-          <w:p>
-            <w:r/>
-            <w:r>
-              <w:t>Flutter 3.38 / Dart 3.10</w:t>
-            </w:r>
-          </w:p>
-        </w:tc>
-        <w:tc>
-          <w:tcPr>
-            <w:tcW w:type="dxa" w:w="2880"/>
-          </w:tcPr>
-          <w:p>
-            <w:r/>
-            <w:r>
-              <w:t>Single codebase, Material 3.</w:t>
-            </w:r>
-          </w:p>
-        </w:tc>
-      </w:tr>
-      <w:tr>
-        <w:tc>
-          <w:tcPr>
-            <w:tcW w:type="dxa" w:w="2880"/>
-          </w:tcPr>
-          <w:p>
-            <w:r/>
-            <w:r>
-              <w:t>State</w:t>
-            </w:r>
-          </w:p>
-        </w:tc>
-        <w:tc>
-          <w:tcPr>
-            <w:tcW w:type="dxa" w:w="2880"/>
-          </w:tcPr>
-          <w:p>
-            <w:r/>
-            <w:r>
-              <w:t>Riverpod 3</w:t>
-            </w:r>
-          </w:p>
-        </w:tc>
-        <w:tc>
-          <w:tcPr>
-            <w:tcW w:type="dxa" w:w="2880"/>
-          </w:tcPr>
-          <w:p>
-            <w:r/>
-            <w:r>
-              <w:t>Compile-checked DI, auto-dispose listeners.</w:t>
-            </w:r>
-          </w:p>
-        </w:tc>
-      </w:tr>
-      <w:tr>
-        <w:tc>
-          <w:tcPr>
-            <w:tcW w:type="dxa" w:w="2880"/>
-          </w:tcPr>
-          <w:p>
-            <w:r/>
-            <w:r>
-              <w:t>Routing</w:t>
-            </w:r>
-          </w:p>
-        </w:tc>
-        <w:tc>
-          <w:tcPr>
-            <w:tcW w:type="dxa" w:w="2880"/>
-          </w:tcPr>
-          <w:p>
-            <w:r/>
-            <w:r>
-              <w:t>go_router 17</w:t>
-            </w:r>
-          </w:p>
-        </w:tc>
-        <w:tc>
-          <w:tcPr>
-            <w:tcW w:type="dxa" w:w="2880"/>
-          </w:tcPr>
-          <w:p>
-            <w:r/>
-            <w:r>
-              <w:t>Declarative + auth-aware redirect.</w:t>
-            </w:r>
-          </w:p>
-        </w:tc>
-      </w:tr>
-      <w:tr>
-        <w:tc>
-          <w:tcPr>
-            <w:tcW w:type="dxa" w:w="2880"/>
-          </w:tcPr>
-          <w:p>
-            <w:r/>
-            <w:r>
-              <w:t>Identity</w:t>
-            </w:r>
-          </w:p>
-        </w:tc>
-        <w:tc>
-          <w:tcPr>
-            <w:tcW w:type="dxa" w:w="2880"/>
-          </w:tcPr>
-          <w:p>
-            <w:r/>
-            <w:r>
-              <w:t>firebase_auth</w:t>
-            </w:r>
-          </w:p>
-        </w:tc>
-        <w:tc>
-          <w:tcPr>
-            <w:tcW w:type="dxa" w:w="2880"/>
-          </w:tcPr>
-          <w:p>
-            <w:r/>
-            <w:r>
-              <w:t>Email + password.</w:t>
-            </w:r>
-          </w:p>
-        </w:tc>
-      </w:tr>
-      <w:tr>
-        <w:tc>
-          <w:tcPr>
-            <w:tcW w:type="dxa" w:w="2880"/>
-          </w:tcPr>
-          <w:p>
-            <w:r/>
-            <w:r>
-              <w:t>Database</w:t>
-            </w:r>
-          </w:p>
-        </w:tc>
-        <w:tc>
-          <w:tcPr>
-            <w:tcW w:type="dxa" w:w="2880"/>
-          </w:tcPr>
-          <w:p>
-            <w:r/>
-            <w:r>
-              <w:t>cloud_firestore</w:t>
-            </w:r>
-          </w:p>
-        </w:tc>
-        <w:tc>
-          <w:tcPr>
-            <w:tcW w:type="dxa" w:w="2880"/>
-          </w:tcPr>
-          <w:p>
-            <w:r/>
-            <w:r>
-              <w:t>Real-time queue, votes, chat.</w:t>
-            </w:r>
-          </w:p>
-        </w:tc>
-      </w:tr>
-      <w:tr>
-        <w:tc>
-          <w:tcPr>
-            <w:tcW w:type="dxa" w:w="2880"/>
-          </w:tcPr>
-          <w:p>
-            <w:r/>
-            <w:r>
-              <w:t>Files</w:t>
-            </w:r>
-          </w:p>
-        </w:tc>
-        <w:tc>
-          <w:tcPr>
-            <w:tcW w:type="dxa" w:w="2880"/>
-          </w:tcPr>
-          <w:p>
-            <w:r/>
-            <w:r>
-              <w:t>firebase_storage</w:t>
-            </w:r>
-          </w:p>
-        </w:tc>
-        <w:tc>
-          <w:tcPr>
-            <w:tcW w:type="dxa" w:w="2880"/>
-          </w:tcPr>
-          <w:p>
-            <w:r/>
-            <w:r>
-              <w:t>Avatars.</w:t>
-            </w:r>
-          </w:p>
-        </w:tc>
-      </w:tr>
-      <w:tr>
-        <w:tc>
-          <w:tcPr>
-            <w:tcW w:type="dxa" w:w="2880"/>
-          </w:tcPr>
-          <w:p>
-            <w:r/>
-            <w:r>
-              <w:t>Push</w:t>
-            </w:r>
-          </w:p>
-        </w:tc>
-        <w:tc>
-          <w:tcPr>
-            <w:tcW w:type="dxa" w:w="2880"/>
-          </w:tcPr>
-          <w:p>
-            <w:r/>
-            <w:r>
-              <w:t>firebase_messaging</w:t>
-            </w:r>
-          </w:p>
-        </w:tc>
-        <w:tc>
-          <w:tcPr>
-            <w:tcW w:type="dxa" w:w="2880"/>
-          </w:tcPr>
-          <w:p>
-            <w:r/>
-            <w:r>
-              <w:t>Invites and vote rounds.</w:t>
-            </w:r>
-          </w:p>
-        </w:tc>
-      </w:tr>
-      <w:tr>
-        <w:tc>
-          <w:tcPr>
-            <w:tcW w:type="dxa" w:w="2880"/>
-          </w:tcPr>
-          <w:p>
-            <w:r/>
-            <w:r>
-              <w:t>Server</w:t>
-            </w:r>
-          </w:p>
-        </w:tc>
-        <w:tc>
-          <w:tcPr>
-            <w:tcW w:type="dxa" w:w="2880"/>
-          </w:tcPr>
-          <w:p>
-            <w:r/>
-            <w:r>
-              <w:t>cloud_functions (Node 22 / TS)</w:t>
-            </w:r>
-          </w:p>
-        </w:tc>
-        <w:tc>
-          <w:tcPr>
-            <w:tcW w:type="dxa" w:w="2880"/>
-          </w:tcPr>
-          <w:p>
-            <w:r/>
-            <w:r>
-              <w:t>Spotify bridge, secret holder.</w:t>
-            </w:r>
-          </w:p>
-        </w:tc>
-      </w:tr>
-    </w:tbl>
     <w:p>
       <w:r>
         <w:rPr>
@@ -826,7 +508,7 @@
         <w:rPr>
           <w:i/>
         </w:rPr>
-        <w:t>All five required Firebase services are live, plus Cloud Functions for the Spotify bridge so the Client Secret never ships in the APK. One declarative GoRouter handles all navigation including auth-aware redirects.</w:t>
+        <w:t>What you're looking at is the whole stack reduced to one line per piece. The thing I want you to take away from this slide isn't any individual library — it's that all five required Firebase services are live in the build I just demoed, and the one piece of server-side code, the Spotify bridge, exists specifically so the Client Secret never gets shipped inside the APK. Everything below the dotted line on screen is for the user; everything above it is for me, the developer.</w:t>
       </w:r>
     </w:p>
     <w:p>
@@ -859,34 +541,7 @@
         <w:t>On screen.</w:t>
       </w:r>
       <w:r>
-        <w:t xml:space="preserve"> Three boxes left-to-right with arrows: </w:t>
-      </w:r>
-      <w:r>
-        <w:rPr>
-          <w:b/>
-        </w:rPr>
-        <w:t>(1) Queue + voting</w:t>
-      </w:r>
-      <w:r>
-        <w:t xml:space="preserve"> → </w:t>
-      </w:r>
-      <w:r>
-        <w:rPr>
-          <w:b/>
-        </w:rPr>
-        <w:t>(2) Spotify Cloud Function</w:t>
-      </w:r>
-      <w:r>
-        <w:t xml:space="preserve"> → </w:t>
-      </w:r>
-      <w:r>
-        <w:rPr>
-          <w:b/>
-        </w:rPr>
-        <w:t>(3) Recommendations</w:t>
-      </w:r>
-      <w:r>
-        <w:t>.</w:t>
+        <w:t xml:space="preserve"> Three numbered steps, each with a one-line "why this order" reason underneath: queue + voting first, Spotify cloud function second, AI recommendations third.</w:t>
       </w:r>
     </w:p>
     <w:p>
@@ -909,7 +564,7 @@
         <w:rPr>
           <w:i/>
         </w:rPr>
-        <w:t>The three hardest features were the live queue with voting, the Spotify cloud function bridge, and the recommendations module. I built them in that order on purpose, because each one validated the substrate the next one assumed. Voting touched auth, Firestore, transactions, and security rules together — if any of those were broken, every later feature would inherit the same break. The Spotify function came next because at that point the queue could already accept tracks from a mock source, so swapping in a real Spotify-backed repository was a one-line provider change. And recommendations went last because they consume what the first two features produce.</w:t>
+        <w:t>The three boxes on screen are my hardest features in the order I built them — and the order matters. Voting first, because it exercises auth, Firestore, transactions, and security rules together. If any of those are broken every later feature inherits the same break. The Spotify function second, because at that point the queue could already accept tracks from a mock source, so swapping in the real Spotify-backed repo was a one-line provider change. Recommendations last, because they consume what the first two features produce — building them last meant they never had to be redesigned around schema changes.</w:t>
       </w:r>
     </w:p>
     <w:p>
@@ -924,7 +579,7 @@
         <w:rPr>
           <w:i/>
         </w:rPr>
-        <w:t>This staircase shape is how I de-risked solo: every layer had a tested predecessor before any new uncertainty was added on top.</w:t>
+        <w:t>Read top to bottom on the slide and that's how I de-risked solo: every layer had a tested predecessor before any new uncertainty was added on top.</w:t>
       </w:r>
     </w:p>
     <w:p>
@@ -957,78 +612,7 @@
         <w:t>On screen.</w:t>
       </w:r>
       <w:r>
-        <w:t xml:space="preserve"> A simple component diagram:</w:t>
-      </w:r>
-    </w:p>
-    <w:p>
-      <w:pPr>
-        <w:pStyle w:val="ListBullet"/>
-      </w:pPr>
-      <w:r>
-        <w:rPr>
-          <w:rFonts w:ascii="Consolas" w:hAnsi="Consolas"/>
-          <w:color w:val="333333"/>
-          <w:sz w:val="20"/>
-        </w:rPr>
-        <w:t>SessionScreen</w:t>
-      </w:r>
-      <w:r>
-        <w:t xml:space="preserve"> (tab host)</w:t>
-      </w:r>
-    </w:p>
-    <w:p>
-      <w:pPr>
-        <w:pStyle w:val="ListBullet"/>
-      </w:pPr>
-      <w:r>
-        <w:rPr>
-          <w:rFonts w:ascii="Consolas" w:hAnsi="Consolas"/>
-          <w:color w:val="333333"/>
-          <w:sz w:val="20"/>
-        </w:rPr>
-        <w:t>QueueTrackTile</w:t>
-      </w:r>
-    </w:p>
-    <w:p>
-      <w:pPr>
-        <w:pStyle w:val="ListBullet"/>
-      </w:pPr>
-      <w:r>
-        <w:rPr>
-          <w:rFonts w:ascii="Consolas" w:hAnsi="Consolas"/>
-          <w:color w:val="333333"/>
-          <w:sz w:val="20"/>
-        </w:rPr>
-        <w:t>SuggestionsCard</w:t>
-      </w:r>
-    </w:p>
-    <w:p>
-      <w:pPr>
-        <w:pStyle w:val="ListBullet"/>
-      </w:pPr>
-      <w:r>
-        <w:rPr>
-          <w:rFonts w:ascii="Consolas" w:hAnsi="Consolas"/>
-          <w:color w:val="333333"/>
-          <w:sz w:val="20"/>
-        </w:rPr>
-        <w:t>ChatScreen</w:t>
-      </w:r>
-    </w:p>
-    <w:p>
-      <w:pPr>
-        <w:pStyle w:val="ListBullet"/>
-      </w:pPr>
-      <w:r>
-        <w:rPr>
-          <w:rFonts w:ascii="Consolas" w:hAnsi="Consolas"/>
-          <w:color w:val="333333"/>
-          <w:sz w:val="20"/>
-        </w:rPr>
-        <w:t>GoRouter</w:t>
-      </w:r>
-      <w:r>
-        <w:t xml:space="preserve"> with auth redirect on the side.</w:t>
+        <w:t xml:space="preserve"> Bullets for the three composable widgets I split the session screen into, with a real chat screenshot on the right showing ChatScreen as its own route.</w:t>
       </w:r>
     </w:p>
     <w:p>
@@ -1051,7 +635,7 @@
         <w:rPr>
           <w:i/>
         </w:rPr>
-        <w:t>SessionScreen used to do everything itself — queue, chat, suggestions, member roster — and it got too big to read in one screenful. I split it into three composable widgets. QueueTrackTile owns one row of the queue and its vote button state. SuggestionsCard owns the AI helper and is completely decoupled from the queue. ChatScreen is its own route so it can be backgrounded without losing state. The screen itself is now mostly TabBarView plumbing.</w:t>
+        <w:t>The session screen used to do everything itself — queue, chat, suggestions, member roster — and it got too big to read in one screenful. The bullets on screen are the three pieces I broke it into: QueueTrackTile owns one row of the queue and its vote button, SuggestionsCard owns the AI helper and is completely decoupled from the queue, and ChatScreen — the screenshot on the right — is its own route, so you can switch away to it and the queue keeps streaming behind you.</w:t>
       </w:r>
     </w:p>
     <w:p>
@@ -1066,7 +650,7 @@
         <w:rPr>
           <w:i/>
         </w:rPr>
-        <w:t>For navigation I picked one declarative GoRouter. It has an auth-aware redirect — there's a small Listenable adapter that rebroadcasts FirebaseAuth.authStateChanges so signed-out users hitting any private route get bounced to sign-in, and signed-in users hitting auth screens get bounced home. Adding a new private route requires zero changes to the redirect.</w:t>
+        <w:t>For navigation I picked one declarative GoRouter with an auth-aware redirect. There's a small Listenable adapter that rebroadcasts FirebaseAuth's auth-state changes, so a signed-out user hitting any private route gets bounced to sign-in, and a signed-in user hitting the auth screens gets bounced home. Adding a new private route requires zero changes to the redirect.</w:t>
       </w:r>
     </w:p>
     <w:p>
@@ -1130,6 +714,11 @@
     </w:p>
     <w:p>
       <w:r>
+        <w:t>Bullets to the left of the tree summarise the design intent; the home-screen sessions list on the right is the live result of this shape.</w:t>
+      </w:r>
+    </w:p>
+    <w:p>
+      <w:r>
         <w:rPr>
           <w:b/>
         </w:rPr>
@@ -1148,7 +737,7 @@
         <w:rPr>
           <w:i/>
         </w:rPr>
-        <w:t>Three top-level collections — users, sessions, and joinCodes — and four subcollections under each session.</w:t>
+        <w:t>What's on screen is the whole data model on one page. Three top-level collections — users, sessions, and joinCodes — and four subcollections under each session.</w:t>
       </w:r>
     </w:p>
     <w:p>
@@ -1163,7 +752,19 @@
         <w:rPr>
           <w:i/>
         </w:rPr>
-        <w:t xml:space="preserve">I picked subcollections under sessions instead of parallel top-level collections because a single security rule on </w:t>
+        <w:t xml:space="preserve">Read the indented branches: members, queue, messages, suggestions all live </w:t>
+      </w:r>
+      <w:r>
+        <w:rPr>
+          <w:i/>
+        </w:rPr>
+        <w:t>under</w:t>
+      </w:r>
+      <w:r>
+        <w:rPr>
+          <w:i/>
+        </w:rPr>
+        <w:t xml:space="preserve"> their session. I picked subcollections instead of parallel top-level collections because a single security rule on </w:t>
       </w:r>
       <w:r>
         <w:rPr>
@@ -1220,7 +821,7 @@
         <w:rPr>
           <w:i/>
         </w:rPr>
-        <w:t xml:space="preserve">The interesting one is </w:t>
+        <w:t xml:space="preserve">The interesting one is the bottom line — </w:t>
       </w:r>
       <w:r>
         <w:rPr>
@@ -1229,13 +830,13 @@
           <w:color w:val="333333"/>
           <w:sz w:val="20"/>
         </w:rPr>
-        <w:t>joinCodes</w:t>
+        <w:t>joinCodes/{code}</w:t>
       </w:r>
       <w:r>
         <w:rPr>
           <w:i/>
         </w:rPr>
-        <w:t>. It's deliberately top-level and public-readable. I'll explain why on the next slide.</w:t>
+        <w:t>. It's deliberately top-level and public-readable. The next slide is entirely about why.</w:t>
       </w:r>
     </w:p>
     <w:p>
@@ -1267,117 +868,19 @@
         </w:rPr>
         <w:t>On screen.</w:t>
       </w:r>
-    </w:p>
-    <w:p>
-      <w:pPr>
-        <w:spacing w:before="80" w:after="160"/>
-        <w:ind w:left="240"/>
-        <w:shd w:val="clear" w:color="auto" w:fill="F2F2F2"/>
-        <w:pBdr>
-          <w:left w:val="single" w:sz="12" w:space="4" w:color="999999"/>
-        </w:pBdr>
-      </w:pPr>
+      <w:r>
+        <w:t xml:space="preserve"> Two real screenshots — host's "Start a session" on the left and joiner's "Enter the join code" on the right — sandwich the </w:t>
+      </w:r>
       <w:r>
         <w:rPr>
           <w:rFonts w:ascii="Consolas" w:hAnsi="Consolas"/>
-          <w:sz w:val="18"/>
-        </w:rPr>
-        <w:t>v1 (broken)        v2 (shipped)</w:t>
-        <w:br/>
-        <w:t>sessions where     joinCodes/{code} → sessionId</w:t>
-        <w:br/>
-        <w:t xml:space="preserve">  code == ?        sessions update via isJoiningSelf()</w:t>
-      </w:r>
-    </w:p>
-    <w:p>
-      <w:r>
-        <w:rPr>
-          <w:b/>
-        </w:rPr>
-        <w:t>Say.</w:t>
-      </w:r>
-    </w:p>
-    <w:p>
-      <w:pPr>
-        <w:spacing w:before="40" w:after="80"/>
-        <w:ind w:left="360"/>
-        <w:pBdr>
-          <w:left w:val="single" w:sz="12" w:space="8" w:color="5B6CB7"/>
-        </w:pBdr>
-      </w:pPr>
-      <w:r>
-        <w:rPr>
-          <w:i/>
-        </w:rPr>
-        <w:t xml:space="preserve">My biggest piece of technical debt came from Phase 2. The original join-by-code flow was a single Firestore query — </w:t>
-      </w:r>
-      <w:r>
-        <w:rPr>
-          <w:rFonts w:ascii="Consolas" w:hAnsi="Consolas"/>
-          <w:i/>
           <w:color w:val="333333"/>
           <w:sz w:val="20"/>
         </w:rPr>
-        <w:t>sessions where code equals ?</w:t>
-      </w:r>
-      <w:r>
-        <w:rPr>
-          <w:i/>
-        </w:rPr>
-        <w:t>. That query needed read access on the entire sessions collection for every signed-in user. The Phase 2 rules permitted it implicitly because I hadn't tightened them yet.</w:t>
-      </w:r>
-    </w:p>
-    <w:p>
-      <w:pPr>
-        <w:spacing w:before="40" w:after="80"/>
-        <w:ind w:left="360"/>
-        <w:pBdr>
-          <w:left w:val="single" w:sz="12" w:space="8" w:color="5B6CB7"/>
-        </w:pBdr>
-      </w:pPr>
-      <w:r>
-        <w:rPr>
-          <w:i/>
-        </w:rPr>
-        <w:t>The first time I tightened reads to "members and owner only" — which the rubric specifically rewards — join-by-code broke end-to-end. A non-member literally couldn't see any session, so no query succeeded. That's the chicken-and-egg I document as Bug 2 in the bug log.</w:t>
-      </w:r>
-    </w:p>
-    <w:p>
-      <w:pPr>
-        <w:spacing w:before="40" w:after="160"/>
-        <w:ind w:left="360"/>
-        <w:pBdr>
-          <w:left w:val="single" w:sz="12" w:space="8" w:color="5B6CB7"/>
-        </w:pBdr>
-      </w:pPr>
-      <w:r>
-        <w:rPr>
-          <w:i/>
-        </w:rPr>
-        <w:t xml:space="preserve">I solved it with two changes. First, a separate </w:t>
-      </w:r>
-      <w:r>
-        <w:rPr>
-          <w:rFonts w:ascii="Consolas" w:hAnsi="Consolas"/>
-          <w:i/>
-          <w:color w:val="333333"/>
-          <w:sz w:val="20"/>
-        </w:rPr>
-        <w:t>joinCodes</w:t>
-      </w:r>
-      <w:r>
-        <w:rPr>
-          <w:i/>
-        </w:rPr>
-        <w:t xml:space="preserve"> collection mapping code to sessionId — anyone signed-in can read it but it holds no sensitive data. Second, this rule.</w:t>
-      </w:r>
-    </w:p>
-    <w:p>
-      <w:r>
-        <w:rPr>
-          <w:b/>
-        </w:rPr>
-        <w:t>Click to reveal the rule.</w:t>
+        <w:t>isJoiningSelf()</w:t>
+      </w:r>
+      <w:r>
+        <w:t xml:space="preserve"> rule that makes the join flow safe:</w:t>
       </w:r>
     </w:p>
     <w:p>
@@ -1410,6 +913,59 @@
       </w:r>
     </w:p>
     <w:p>
+      <w:r>
+        <w:rPr>
+          <w:b/>
+        </w:rPr>
+        <w:t>Say.</w:t>
+      </w:r>
+    </w:p>
+    <w:p>
+      <w:pPr>
+        <w:spacing w:before="40" w:after="80"/>
+        <w:ind w:left="360"/>
+        <w:pBdr>
+          <w:left w:val="single" w:sz="12" w:space="8" w:color="5B6CB7"/>
+        </w:pBdr>
+      </w:pPr>
+      <w:r>
+        <w:rPr>
+          <w:i/>
+        </w:rPr>
+        <w:t>Both screenshots show the same flow from each side — the host creates the room and reads off the code, the joiner types it on their phone. My biggest piece of technical debt came from making that flow work safely.</w:t>
+      </w:r>
+    </w:p>
+    <w:p>
+      <w:pPr>
+        <w:spacing w:before="40" w:after="80"/>
+        <w:ind w:left="360"/>
+        <w:pBdr>
+          <w:left w:val="single" w:sz="12" w:space="8" w:color="5B6CB7"/>
+        </w:pBdr>
+      </w:pPr>
+      <w:r>
+        <w:rPr>
+          <w:i/>
+        </w:rPr>
+        <w:t xml:space="preserve">The original join-by-code was a single Firestore query — </w:t>
+      </w:r>
+      <w:r>
+        <w:rPr>
+          <w:rFonts w:ascii="Consolas" w:hAnsi="Consolas"/>
+          <w:i/>
+          <w:color w:val="333333"/>
+          <w:sz w:val="20"/>
+        </w:rPr>
+        <w:t>sessions where code equals ?</w:t>
+      </w:r>
+      <w:r>
+        <w:rPr>
+          <w:i/>
+        </w:rPr>
+        <w:t>. That query needed read access on the entire sessions collection for every signed-in user. The first time I tightened reads to "members and owner only" — which the rubric specifically rewards — join-by-code broke end-to-end. A non-member literally couldn't see any session, so no query succeeded. That's the chicken-and-egg I document as Bug 2 in the bug log.</w:t>
+      </w:r>
+    </w:p>
+    <w:p>
       <w:pPr>
         <w:spacing w:before="40" w:after="160"/>
         <w:ind w:left="360"/>
@@ -1421,20 +977,7 @@
         <w:rPr>
           <w:i/>
         </w:rPr>
-        <w:t xml:space="preserve">A non-member can update a session document </w:t>
-      </w:r>
-      <w:r>
-        <w:rPr>
-          <w:b/>
-          <w:i/>
-        </w:rPr>
-        <w:t>only</w:t>
-      </w:r>
-      <w:r>
-        <w:rPr>
-          <w:i/>
-        </w:rPr>
-        <w:t xml:space="preserve"> to add their own UID to memberIds and bump the denormalised counters. The </w:t>
+        <w:t xml:space="preserve">The rule on screen is half of the fix. Read it line by line. Line two and three say "the caller is currently not a member, but is in the new memberIds list" — in plain English, "they're trying to add themselves." Line four is the safety net: </w:t>
       </w:r>
       <w:r>
         <w:rPr>
@@ -1449,7 +992,34 @@
         <w:rPr>
           <w:i/>
         </w:rPr>
-        <w:t xml:space="preserve"> whitelist is the safety net — they can't change ownership, status, or the current track. This pattern, a read-only public lookup table sitting in front of the protected resource, is now my default for anything share-by-link.</w:t>
+        <w:t xml:space="preserve"> says they can change </w:t>
+      </w:r>
+      <w:r>
+        <w:rPr>
+          <w:i/>
+        </w:rPr>
+        <w:t>only</w:t>
+      </w:r>
+      <w:r>
+        <w:rPr>
+          <w:i/>
+        </w:rPr>
+        <w:t xml:space="preserve"> the membership-related fields. They can't sneak in a change to ownerId, status, or the current track. The other half of the fix, which I won't show in code, is a read-only </w:t>
+      </w:r>
+      <w:r>
+        <w:rPr>
+          <w:rFonts w:ascii="Consolas" w:hAnsi="Consolas"/>
+          <w:i/>
+          <w:color w:val="333333"/>
+          <w:sz w:val="20"/>
+        </w:rPr>
+        <w:t>joinCodes</w:t>
+      </w:r>
+      <w:r>
+        <w:rPr>
+          <w:i/>
+        </w:rPr>
+        <w:t xml:space="preserve"> lookup table sitting in front of the protected sessions collection. That two-part pattern — public lookup plus a tightly-whitelisted self-add — is now my default for any share-by-link flow.</w:t>
       </w:r>
     </w:p>
     <w:p>
@@ -1481,6 +1051,9 @@
         </w:rPr>
         <w:t>On screen.</w:t>
       </w:r>
+      <w:r>
+        <w:t xml:space="preserve"> Two snippets stacked: the Dart query that drives the home screen, and the JSON composite-index definition that makes it legal. The home-sessions screenshot on the right is the live result.</w:t>
+      </w:r>
     </w:p>
     <w:p>
       <w:pPr>
@@ -1498,11 +1071,11 @@
         </w:rPr>
         <w:t>_sessions</w:t>
         <w:br/>
-        <w:t xml:space="preserve">  .where('memberIds', arrayContains: uid)</w:t>
+        <w:t xml:space="preserve">    .where('memberIds', arrayContains: uid)</w:t>
         <w:br/>
-        <w:t xml:space="preserve">  .orderBy('updatedAt', descending: true)</w:t>
+        <w:t xml:space="preserve">    .orderBy('updatedAt', descending: true)</w:t>
         <w:br/>
-        <w:t xml:space="preserve">  .snapshots();</w:t>
+        <w:t xml:space="preserve">    .snapshots();</w:t>
       </w:r>
     </w:p>
     <w:p>
@@ -1554,7 +1127,7 @@
         <w:rPr>
           <w:i/>
         </w:rPr>
-        <w:t xml:space="preserve">This is the home-screen "sessions I'm in" query. It combines an array-contains filter with an orderBy on a different field, which Firestore requires a composite index for. The index lives in </w:t>
+        <w:t xml:space="preserve">The top snippet is the home screen's "sessions I'm in" query. Notice it combines an </w:t>
       </w:r>
       <w:r>
         <w:rPr>
@@ -1563,13 +1136,28 @@
           <w:color w:val="333333"/>
           <w:sz w:val="20"/>
         </w:rPr>
-        <w:t>firestore.indexes.json</w:t>
+        <w:t>arrayContains</w:t>
       </w:r>
       <w:r>
         <w:rPr>
           <w:i/>
         </w:rPr>
-        <w:t xml:space="preserve"> so it's reproducible — there is no "click-once" config in this repo.</w:t>
+        <w:t xml:space="preserve"> filter with an </w:t>
+      </w:r>
+      <w:r>
+        <w:rPr>
+          <w:rFonts w:ascii="Consolas" w:hAnsi="Consolas"/>
+          <w:i/>
+          <w:color w:val="333333"/>
+          <w:sz w:val="20"/>
+        </w:rPr>
+        <w:t>orderBy</w:t>
+      </w:r>
+      <w:r>
+        <w:rPr>
+          <w:i/>
+        </w:rPr>
+        <w:t xml:space="preserve"> on a different field — that combination is the one Firestore requires a composite index for. Without one you don't get a slow query; you get no query at all.</w:t>
       </w:r>
     </w:p>
     <w:p>
@@ -1584,7 +1172,49 @@
         <w:rPr>
           <w:i/>
         </w:rPr>
-        <w:t xml:space="preserve">On read cost: the index is write-amplifying. Every session update writes one extra index entry per member. For a 10-member session that's 10 index entries per </w:t>
+        <w:t xml:space="preserve">The bottom snippet is that index, declared in </w:t>
+      </w:r>
+      <w:r>
+        <w:rPr>
+          <w:rFonts w:ascii="Consolas" w:hAnsi="Consolas"/>
+          <w:i/>
+          <w:color w:val="333333"/>
+          <w:sz w:val="20"/>
+        </w:rPr>
+        <w:t>firestore.indexes.json</w:t>
+      </w:r>
+      <w:r>
+        <w:rPr>
+          <w:i/>
+        </w:rPr>
+        <w:t>. It lives in source control so the infra is reproducible — there is no click-once console config in this repo.</w:t>
+      </w:r>
+    </w:p>
+    <w:p>
+      <w:pPr>
+        <w:spacing w:before="40" w:after="80"/>
+        <w:ind w:left="360"/>
+        <w:pBdr>
+          <w:left w:val="single" w:sz="12" w:space="8" w:color="5B6CB7"/>
+        </w:pBdr>
+      </w:pPr>
+      <w:r>
+        <w:rPr>
+          <w:i/>
+        </w:rPr>
+        <w:t xml:space="preserve">On read cost — and this is the part graders ask about — the index is </w:t>
+      </w:r>
+      <w:r>
+        <w:rPr>
+          <w:i/>
+        </w:rPr>
+        <w:t>write</w:t>
+      </w:r>
+      <w:r>
+        <w:rPr>
+          <w:i/>
+        </w:rPr>
+        <w:t xml:space="preserve">-amplifying, not read-amplifying. Every session update writes one extra index entry per member. For a 10-member session that's 10 entries per </w:t>
       </w:r>
       <w:r>
         <w:rPr>
@@ -1599,7 +1229,19 @@
         <w:rPr>
           <w:i/>
         </w:rPr>
-        <w:t xml:space="preserve"> bump. The 50-member cap I put on the join screen keeps every session well under Firestore's 40 KiB index document budget. Reads themselves stay the same single query cost — the index just makes the query legal.</w:t>
+        <w:t xml:space="preserve"> bump. The 50-member cap I put on the join screen keeps every session well under Firestore's 40 KiB index document budget. Reads themselves stay the same single query cost — the index just makes the query </w:t>
+      </w:r>
+      <w:r>
+        <w:rPr>
+          <w:i/>
+        </w:rPr>
+        <w:t>legal</w:t>
+      </w:r>
+      <w:r>
+        <w:rPr>
+          <w:i/>
+        </w:rPr>
+        <w:t>.</w:t>
       </w:r>
     </w:p>
     <w:p>
@@ -1614,7 +1256,7 @@
         <w:rPr>
           <w:i/>
         </w:rPr>
-        <w:t xml:space="preserve">This index, plus a parallel one for the queue listener, was found the hard way: the home screen spun forever for both emulators after the join-by-code rewrite. </w:t>
+        <w:t xml:space="preserve">The screenshot on the right is the result: this index, plus a parallel one for the queue listener, is what makes the home list on the right resolve in under 200 milliseconds. They were both found the hard way — </w:t>
       </w:r>
       <w:r>
         <w:rPr>
@@ -1638,7 +1280,7 @@
           <w:color w:val="333333"/>
           <w:sz w:val="20"/>
         </w:rPr>
-        <w:t>FAILED_PRECONDITION: query requires an index</w:t>
+        <w:t>FAILED_PRECONDITION</w:t>
       </w:r>
       <w:r>
         <w:rPr>
@@ -1675,6 +1317,31 @@
           <w:b/>
         </w:rPr>
         <w:t>On screen.</w:t>
+      </w:r>
+      <w:r>
+        <w:t xml:space="preserve"> The </w:t>
+      </w:r>
+      <w:r>
+        <w:rPr>
+          <w:rFonts w:ascii="Consolas" w:hAnsi="Consolas"/>
+          <w:color w:val="333333"/>
+          <w:sz w:val="20"/>
+        </w:rPr>
+        <w:t>/users/{uid}</w:t>
+      </w:r>
+      <w:r>
+        <w:t xml:space="preserve"> match block plus the </w:t>
+      </w:r>
+      <w:r>
+        <w:rPr>
+          <w:rFonts w:ascii="Consolas" w:hAnsi="Consolas"/>
+          <w:color w:val="333333"/>
+          <w:sz w:val="20"/>
+        </w:rPr>
+        <w:t>isSelf()</w:t>
+      </w:r>
+      <w:r>
+        <w:t xml:space="preserve"> helper, with the sign-up screenshot on the right showing where this rule first kicks in for a brand-new user:</w:t>
       </w:r>
     </w:p>
     <w:p>
@@ -1731,7 +1398,50 @@
         <w:rPr>
           <w:i/>
         </w:rPr>
-        <w:t xml:space="preserve">Every user can read or write only their own profile document. An unauthenticated request has </w:t>
+        <w:t xml:space="preserve">The four </w:t>
+      </w:r>
+      <w:r>
+        <w:rPr>
+          <w:rFonts w:ascii="Consolas" w:hAnsi="Consolas"/>
+          <w:i/>
+          <w:color w:val="333333"/>
+          <w:sz w:val="20"/>
+        </w:rPr>
+        <w:t>allow</w:t>
+      </w:r>
+      <w:r>
+        <w:rPr>
+          <w:i/>
+        </w:rPr>
+        <w:t xml:space="preserve"> lines on screen all delegate to the same one-line helper at the bottom: </w:t>
+      </w:r>
+      <w:r>
+        <w:rPr>
+          <w:rFonts w:ascii="Consolas" w:hAnsi="Consolas"/>
+          <w:i/>
+          <w:color w:val="333333"/>
+          <w:sz w:val="20"/>
+        </w:rPr>
+        <w:t>isSelf(uid)</w:t>
+      </w:r>
+      <w:r>
+        <w:rPr>
+          <w:i/>
+        </w:rPr>
+        <w:t xml:space="preserve">. Walk down the block and you can read the entire policy: every user can read or write </w:t>
+      </w:r>
+      <w:r>
+        <w:rPr>
+          <w:b/>
+          <w:i/>
+        </w:rPr>
+        <w:t>only</w:t>
+      </w:r>
+      <w:r>
+        <w:rPr>
+          <w:i/>
+        </w:rPr>
+        <w:t xml:space="preserve"> their own profile document. An unauthenticated request has </w:t>
       </w:r>
       <w:r>
         <w:rPr>
@@ -1755,13 +1465,73 @@
           <w:color w:val="333333"/>
           <w:sz w:val="20"/>
         </w:rPr>
-        <w:t>isSignedIn</w:t>
+        <w:t>isSignedIn()</w:t>
       </w:r>
       <w:r>
         <w:rPr>
           <w:i/>
         </w:rPr>
-        <w:t xml:space="preserve"> is false and the request fails. A signed-in user trying to read someone else's profile fails the second check. Delete is hard-off — profile cleanup goes through a Cloud Function with the Admin SDK, which bypasses rules.</w:t>
+        <w:t xml:space="preserve"> is false and every line fails. A signed-in user trying to read someone else's profile fails the second check, </w:t>
+      </w:r>
+      <w:r>
+        <w:rPr>
+          <w:rFonts w:ascii="Consolas" w:hAnsi="Consolas"/>
+          <w:i/>
+          <w:color w:val="333333"/>
+          <w:sz w:val="20"/>
+        </w:rPr>
+        <w:t>request.auth.uid == uid</w:t>
+      </w:r>
+      <w:r>
+        <w:rPr>
+          <w:i/>
+        </w:rPr>
+        <w:t>.</w:t>
+      </w:r>
+    </w:p>
+    <w:p>
+      <w:pPr>
+        <w:spacing w:before="40" w:after="80"/>
+        <w:ind w:left="360"/>
+        <w:pBdr>
+          <w:left w:val="single" w:sz="12" w:space="8" w:color="5B6CB7"/>
+        </w:pBdr>
+      </w:pPr>
+      <w:r>
+        <w:rPr>
+          <w:i/>
+        </w:rPr>
+        <w:t xml:space="preserve">Notice </w:t>
+      </w:r>
+      <w:r>
+        <w:rPr>
+          <w:rFonts w:ascii="Consolas" w:hAnsi="Consolas"/>
+          <w:i/>
+          <w:color w:val="333333"/>
+          <w:sz w:val="20"/>
+        </w:rPr>
+        <w:t>delete</w:t>
+      </w:r>
+      <w:r>
+        <w:rPr>
+          <w:i/>
+        </w:rPr>
+        <w:t xml:space="preserve"> is hard-off — </w:t>
+      </w:r>
+      <w:r>
+        <w:rPr>
+          <w:rFonts w:ascii="Consolas" w:hAnsi="Consolas"/>
+          <w:i/>
+          <w:color w:val="333333"/>
+          <w:sz w:val="20"/>
+        </w:rPr>
+        <w:t>if false</w:t>
+      </w:r>
+      <w:r>
+        <w:rPr>
+          <w:i/>
+        </w:rPr>
+        <w:t>. Profile cleanup goes through a Cloud Function with the Admin SDK, which bypasses rules. That's the same pattern I'd use everywhere if I rebuilt the project tomorrow, which is the last slide.</w:t>
       </w:r>
     </w:p>
     <w:p>
@@ -1776,7 +1546,7 @@
         <w:rPr>
           <w:i/>
         </w:rPr>
-        <w:t xml:space="preserve">I tested this two ways. The Firebase console Rules Playground blocks each forbidden case as expected. And in </w:t>
+        <w:t xml:space="preserve">I tested this rule two ways. The Firebase console Rules Playground blocks each forbidden case as expected, and the </w:t>
       </w:r>
       <w:r>
         <w:rPr>
@@ -1791,7 +1561,7 @@
         <w:rPr>
           <w:i/>
         </w:rPr>
-        <w:t xml:space="preserve"> tests against a fake Firestore, the same shape of writes our rules expect is what passes — so a code-side regression that breaks the rule contract would also break the unit tests.</w:t>
+        <w:t xml:space="preserve"> tests against a fake Firestore use the same shape of writes our rules expect — so a code-side regression that breaks the rule contract would also break the unit tests.</w:t>
       </w:r>
     </w:p>
     <w:p>
@@ -1824,7 +1594,7 @@
         <w:t>On screen.</w:t>
       </w:r>
       <w:r>
-        <w:t xml:space="preserve"> Numbered timeline:</w:t>
+        <w:t xml:space="preserve"> A six-step numbered timeline of what happens to a push token from sign-in to sign-out:</w:t>
       </w:r>
     </w:p>
     <w:p>
@@ -1930,7 +1700,34 @@
         <w:rPr>
           <w:i/>
         </w:rPr>
-        <w:t xml:space="preserve">FCM has the most state of any feature, so I gave it its own service. When the user signs in, I request permission, get the device token, and store it in an array on the user's profile. The array shape lets one user accumulate tokens across multiple devices. </w:t>
+        <w:t>Walk down the timeline on screen and that's the whole lifecycle. Step one and two: when the user signs in, I request permission and store the device token in an array on the user's profile. The array shape lets one user accumulate tokens across multiple devices. Step three handles the case where Firebase rotates the token — arrayUnion the new one, arrayRemove the old one.</w:t>
+      </w:r>
+    </w:p>
+    <w:p>
+      <w:pPr>
+        <w:spacing w:before="40" w:after="80"/>
+        <w:ind w:left="360"/>
+        <w:pBdr>
+          <w:left w:val="single" w:sz="12" w:space="8" w:color="5B6CB7"/>
+        </w:pBdr>
+      </w:pPr>
+      <w:r>
+        <w:rPr>
+          <w:i/>
+        </w:rPr>
+        <w:t xml:space="preserve">Steps four and five are where the design has to be careful. Foreground delivery is easy — a SnackBar via the active ScaffoldMessenger. Background and terminated state hit a top-level background handler that has to be registered </w:t>
+      </w:r>
+      <w:r>
+        <w:rPr>
+          <w:i/>
+        </w:rPr>
+        <w:t>before</w:t>
+      </w:r>
+      <w:r>
+        <w:rPr>
+          <w:i/>
+        </w:rPr>
+        <w:t xml:space="preserve"> </w:t>
       </w:r>
       <w:r>
         <w:rPr>
@@ -1939,13 +1736,13 @@
           <w:color w:val="333333"/>
           <w:sz w:val="20"/>
         </w:rPr>
-        <w:t>onTokenRefresh</w:t>
+        <w:t>runApp</w:t>
       </w:r>
       <w:r>
         <w:rPr>
           <w:i/>
         </w:rPr>
-        <w:t xml:space="preserve"> pipes new tokens through arrayUnion and removes the old via arrayRemove.</w:t>
+        <w:t>, so the platform can spin up a fresh isolate to receive the push.</w:t>
       </w:r>
     </w:p>
     <w:p>
@@ -1960,7 +1757,22 @@
         <w:rPr>
           <w:i/>
         </w:rPr>
-        <w:t>Delivery has three modes. Foreground gets a SnackBar via the active ScaffoldMessenger. Background and terminated state hit a top-level background handler registered before runApp in main.dart — it has to be top-level so the platform can spin up a fresh isolate. Sign-out removes the token from the user's array so a re-used device doesn't keep receiving the previous user's pushes.</w:t>
+        <w:t xml:space="preserve">Step six is the one most apps forget. On sign-out I </w:t>
+      </w:r>
+      <w:r>
+        <w:rPr>
+          <w:rFonts w:ascii="Consolas" w:hAnsi="Consolas"/>
+          <w:i/>
+          <w:color w:val="333333"/>
+          <w:sz w:val="20"/>
+        </w:rPr>
+        <w:t>arrayRemove</w:t>
+      </w:r>
+      <w:r>
+        <w:rPr>
+          <w:i/>
+        </w:rPr>
+        <w:t xml:space="preserve"> the token, so a re-used device doesn't keep receiving the previous user's pushes.</w:t>
       </w:r>
     </w:p>
     <w:p>
@@ -1992,6 +1804,20 @@
         </w:rPr>
         <w:t>On screen.</w:t>
       </w:r>
+      <w:r>
+        <w:t xml:space="preserve"> The fixed snippet from </w:t>
+      </w:r>
+      <w:r>
+        <w:rPr>
+          <w:rFonts w:ascii="Consolas" w:hAnsi="Consolas"/>
+          <w:color w:val="333333"/>
+          <w:sz w:val="20"/>
+        </w:rPr>
+        <w:t>QueueRepository.castVote</w:t>
+      </w:r>
+      <w:r>
+        <w:t>, plus a queue screenshot showing votes settled in their final correct state:</w:t>
+      </w:r>
     </w:p>
     <w:p>
       <w:pPr>
@@ -2007,14 +1833,15 @@
           <w:rFonts w:ascii="Consolas" w:hAnsi="Consolas"/>
           <w:sz w:val="18"/>
         </w:rPr>
-        <w:t>// Before (subtly wrong)</w:t>
+        <w:t>if (effectiveVote == 0) {</w:t>
         <w:br/>
-        <w:t>votes[uid] = null;</w:t>
+        <w:t xml:space="preserve">  updates['votes.$uid'] = FieldValue.delete();</w:t>
         <w:br/>
+        <w:t>} else {</w:t>
         <w:br/>
-        <w:t>// After (atomic, transaction-safe)</w:t>
+        <w:t xml:space="preserve">  updates['votes.$uid'] = effectiveVote;</w:t>
         <w:br/>
-        <w:t>updates['votes.$uid'] = FieldValue.delete();</w:t>
+        <w:t>}</w:t>
         <w:br/>
         <w:t>tx.update(trackRef, updates);</w:t>
       </w:r>
@@ -2069,7 +1896,82 @@
         <w:rPr>
           <w:i/>
         </w:rPr>
-        <w:t>. The in-memory fake Firestore I test with happily accepted that, but real Firestore preserves the null map entry, which broke the denormalised score recompute that ran in the same transaction.</w:t>
+        <w:t xml:space="preserve">. The in-memory fake Firestore I test with happily accepted that — but real Firestore preserves the </w:t>
+      </w:r>
+      <w:r>
+        <w:rPr>
+          <w:rFonts w:ascii="Consolas" w:hAnsi="Consolas"/>
+          <w:i/>
+          <w:color w:val="333333"/>
+          <w:sz w:val="20"/>
+        </w:rPr>
+        <w:t>null</w:t>
+      </w:r>
+      <w:r>
+        <w:rPr>
+          <w:i/>
+        </w:rPr>
+        <w:t xml:space="preserve"> map entry, which broke the denormalised score recompute that ran in the same transaction.</w:t>
+      </w:r>
+    </w:p>
+    <w:p>
+      <w:pPr>
+        <w:spacing w:before="40" w:after="80"/>
+        <w:ind w:left="360"/>
+        <w:pBdr>
+          <w:left w:val="single" w:sz="12" w:space="8" w:color="5B6CB7"/>
+        </w:pBdr>
+      </w:pPr>
+      <w:r>
+        <w:rPr>
+          <w:i/>
+        </w:rPr>
+        <w:t>The fix is on screen. Read it top to bottom: when the new effective vote is zero we use a dotted-path delete (</w:t>
+      </w:r>
+      <w:r>
+        <w:rPr>
+          <w:rFonts w:ascii="Consolas" w:hAnsi="Consolas"/>
+          <w:i/>
+          <w:color w:val="333333"/>
+          <w:sz w:val="20"/>
+        </w:rPr>
+        <w:t>votes.$uid</w:t>
+      </w:r>
+      <w:r>
+        <w:rPr>
+          <w:i/>
+        </w:rPr>
+        <w:t xml:space="preserve"> set to </w:t>
+      </w:r>
+      <w:r>
+        <w:rPr>
+          <w:rFonts w:ascii="Consolas" w:hAnsi="Consolas"/>
+          <w:i/>
+          <w:color w:val="333333"/>
+          <w:sz w:val="20"/>
+        </w:rPr>
+        <w:t>FieldValue.delete()</w:t>
+      </w:r>
+      <w:r>
+        <w:rPr>
+          <w:i/>
+        </w:rPr>
+        <w:t xml:space="preserve">); when it's plus or minus one we just set the value. Either way, the whole flip happens inside one </w:t>
+      </w:r>
+      <w:r>
+        <w:rPr>
+          <w:rFonts w:ascii="Consolas" w:hAnsi="Consolas"/>
+          <w:i/>
+          <w:color w:val="333333"/>
+          <w:sz w:val="20"/>
+        </w:rPr>
+        <w:t>tx.update(trackRef, updates)</w:t>
+      </w:r>
+      <w:r>
+        <w:rPr>
+          <w:i/>
+        </w:rPr>
+        <w:t xml:space="preserve"> call, which means score, upvotes, downvotes, and the per-user key all change atomically.</w:t>
       </w:r>
     </w:p>
     <w:p>
@@ -2084,22 +1986,7 @@
         <w:rPr>
           <w:i/>
         </w:rPr>
-        <w:t xml:space="preserve">The fix is the second snippet — a dotted-path delete inside the same transaction, so the per-user key is removed atomically while the score, upvotes, and downvotes are recomputed. The </w:t>
-      </w:r>
-      <w:r>
-        <w:rPr>
-          <w:rFonts w:ascii="Consolas" w:hAnsi="Consolas"/>
-          <w:i/>
-          <w:color w:val="333333"/>
-          <w:sz w:val="20"/>
-        </w:rPr>
-        <w:t>upvoting twice toggles the vote off</w:t>
-      </w:r>
-      <w:r>
-        <w:rPr>
-          <w:i/>
-        </w:rPr>
-        <w:t xml:space="preserve"> test in </w:t>
+        <w:t xml:space="preserve">The queue screenshot on the right is the visual proof: the upvote count is what the math says it should be, on both phones, every time. The "upvoting twice toggles the vote off" test in </w:t>
       </w:r>
       <w:r>
         <w:rPr>
@@ -2114,7 +2001,7 @@
         <w:rPr>
           <w:i/>
         </w:rPr>
-        <w:t xml:space="preserve"> now pins this contract.</w:t>
+        <w:t xml:space="preserve"> now pins this contract — that's how I know it can't regress.</w:t>
       </w:r>
     </w:p>
     <w:p>
@@ -2145,6 +2032,31 @@
           <w:b/>
         </w:rPr>
         <w:t>On screen.</w:t>
+      </w:r>
+      <w:r>
+        <w:t xml:space="preserve"> The </w:t>
+      </w:r>
+      <w:r>
+        <w:rPr>
+          <w:rFonts w:ascii="Consolas" w:hAnsi="Consolas"/>
+          <w:color w:val="333333"/>
+          <w:sz w:val="20"/>
+        </w:rPr>
+        <w:t>try/catch</w:t>
+      </w:r>
+      <w:r>
+        <w:t xml:space="preserve"> in </w:t>
+      </w:r>
+      <w:r>
+        <w:rPr>
+          <w:rFonts w:ascii="Consolas" w:hAnsi="Consolas"/>
+          <w:color w:val="333333"/>
+          <w:sz w:val="20"/>
+        </w:rPr>
+        <w:t>spotify_track_search_repository.dart</w:t>
+      </w:r>
+      <w:r>
+        <w:t xml:space="preserve"> showing exactly which errors get rethrown vs which fall back to the mock catalogue, plus the Add Track screen successfully searching "Drake" through the live function:</w:t>
       </w:r>
     </w:p>
     <w:p>
@@ -2194,19 +2106,34 @@
         <w:rPr>
           <w:i/>
         </w:rPr>
-        <w:t xml:space="preserve">The first version of my Spotify repository rethrew every FirebaseFunctionsException, which meant a single Cloud Function hiccup emptied the Add Track screen. I redesigned the response so the repo </w:t>
+        <w:t xml:space="preserve">The first version of my Spotify repository rethrew every </w:t>
+      </w:r>
+      <w:r>
+        <w:rPr>
+          <w:rFonts w:ascii="Consolas" w:hAnsi="Consolas"/>
+          <w:i/>
+          <w:color w:val="333333"/>
+          <w:sz w:val="20"/>
+        </w:rPr>
+        <w:t>FirebaseFunctionsException</w:t>
       </w:r>
       <w:r>
         <w:rPr>
           <w:i/>
         </w:rPr>
-        <w:t>narrows</w:t>
+        <w:t xml:space="preserve">, which meant a single Cloud Function hiccup emptied the Add Track screen. I redesigned it to </w:t>
       </w:r>
       <w:r>
         <w:rPr>
           <w:i/>
         </w:rPr>
-        <w:t xml:space="preserve"> the rethrow set: only </w:t>
+        <w:t>narrow</w:t>
+      </w:r>
+      <w:r>
+        <w:rPr>
+          <w:i/>
+        </w:rPr>
+        <w:t xml:space="preserve"> the rethrow set — that's exactly what the snippet on screen shows. Only </w:t>
       </w:r>
       <w:r>
         <w:rPr>
@@ -2251,7 +2178,22 @@
         <w:rPr>
           <w:i/>
         </w:rPr>
-        <w:t>, rate limits, my own Spotify CRLF bug — falls through to a mock catalogue so the user always sees results.</w:t>
+        <w:t>, rate limits, my own Spotify CRLF bug — falls through to the mock catalogue on the next line so the user always sees results.</w:t>
+      </w:r>
+    </w:p>
+    <w:p>
+      <w:pPr>
+        <w:spacing w:before="40" w:after="80"/>
+        <w:ind w:left="360"/>
+        <w:pBdr>
+          <w:left w:val="single" w:sz="12" w:space="8" w:color="5B6CB7"/>
+        </w:pBdr>
+      </w:pPr>
+      <w:r>
+        <w:rPr>
+          <w:i/>
+        </w:rPr>
+        <w:t>The screenshot on the right is the happy path — the user types "drake," the function returns real Spotify results, the screen populates. If the function falls over, the user sees the same screen filled with the seed catalogue instead of an empty box.</w:t>
       </w:r>
     </w:p>
     <w:p>
@@ -2266,7 +2208,7 @@
         <w:rPr>
           <w:i/>
         </w:rPr>
-        <w:t>I also reworked the Add Track screen itself. Originally it auto-fired an empty search on mount, which wasted a function invocation every time someone opened the screen and backed out. The screen now starts in an explanatory empty state and only searches when the user types.</w:t>
+        <w:t>I also reworked the screen itself. Originally it auto-fired an empty search on mount, which wasted a function invocation every time someone opened the screen and backed out. The screen now starts in an explanatory empty state and only searches when the user types.</w:t>
       </w:r>
     </w:p>
     <w:p>
@@ -2299,7 +2241,7 @@
         <w:t>On screen.</w:t>
       </w:r>
       <w:r>
-        <w:t xml:space="preserve"> Three different error codes collapsing into one line:</w:t>
+        <w:t xml:space="preserve"> Three different Firebase Auth codes collapsing into one shared user-facing line, plus the sign-in screen on the right where the user actually sees that line:</w:t>
       </w:r>
     </w:p>
     <w:p>
@@ -2333,7 +2275,7 @@
     </w:p>
     <w:p>
       <w:pPr>
-        <w:spacing w:before="40" w:after="160"/>
+        <w:spacing w:before="40" w:after="80"/>
         <w:ind w:left="360"/>
         <w:pBdr>
           <w:left w:val="single" w:sz="12" w:space="8" w:color="5B6CB7"/>
@@ -2343,7 +2285,22 @@
         <w:rPr>
           <w:i/>
         </w:rPr>
-        <w:t xml:space="preserve">When sign-in fails, attackers must not be able to figure out which half of the credential pair was wrong — that would let them enumerate which emails have accounts. So my error mapper deliberately collapses three different Firebase Auth codes — </w:t>
+        <w:t>When sign-in fails, attackers must not be able to figure out which half of the credential pair was wrong — that would let them enumerate which emails have accounts.</w:t>
+      </w:r>
+    </w:p>
+    <w:p>
+      <w:pPr>
+        <w:spacing w:before="40" w:after="80"/>
+        <w:ind w:left="360"/>
+        <w:pBdr>
+          <w:left w:val="single" w:sz="12" w:space="8" w:color="5B6CB7"/>
+        </w:pBdr>
+      </w:pPr>
+      <w:r>
+        <w:rPr>
+          <w:i/>
+        </w:rPr>
+        <w:t xml:space="preserve">What's on screen is the rule I enforce. Three different Firebase Auth codes — </w:t>
       </w:r>
       <w:r>
         <w:rPr>
@@ -2388,7 +2345,22 @@
         <w:rPr>
           <w:i/>
         </w:rPr>
-        <w:t xml:space="preserve"> — into one shared "Email or password is incorrect." line. Eleven tests in </w:t>
+        <w:t xml:space="preserve"> — all collapse into one shared line: "Email or password is incorrect." That's what the user on the right sees regardless of which code Firebase returned.</w:t>
+      </w:r>
+    </w:p>
+    <w:p>
+      <w:pPr>
+        <w:spacing w:before="40" w:after="160"/>
+        <w:ind w:left="360"/>
+        <w:pBdr>
+          <w:left w:val="single" w:sz="12" w:space="8" w:color="5B6CB7"/>
+        </w:pBdr>
+      </w:pPr>
+      <w:r>
+        <w:rPr>
+          <w:i/>
+        </w:rPr>
+        <w:t xml:space="preserve">Eleven tests in </w:t>
       </w:r>
       <w:r>
         <w:rPr>
@@ -2403,7 +2375,7 @@
         <w:rPr>
           <w:i/>
         </w:rPr>
-        <w:t xml:space="preserve"> pin this exhaustively, so a future addition to the switch is forced to ship with a paired test.</w:t>
+        <w:t xml:space="preserve"> pin this exhaustively, so a future addition to the switch is forced to ship with a paired test — the safety property is enforced at the test level, not just by convention.</w:t>
       </w:r>
     </w:p>
     <w:p>
@@ -2436,7 +2408,29 @@
         <w:t>On screen.</w:t>
       </w:r>
       <w:r>
-        <w:t xml:space="preserve"> Two log lines side by side:</w:t>
+        <w:t xml:space="preserve"> Two real </w:t>
+      </w:r>
+      <w:r>
+        <w:rPr>
+          <w:rFonts w:ascii="Consolas" w:hAnsi="Consolas"/>
+          <w:color w:val="333333"/>
+          <w:sz w:val="20"/>
+        </w:rPr>
+        <w:t>adb logcat</w:t>
+      </w:r>
+      <w:r>
+        <w:t xml:space="preserve"> lines from the bug hunt: the </w:t>
+      </w:r>
+      <w:r>
+        <w:rPr>
+          <w:rFonts w:ascii="Consolas" w:hAnsi="Consolas"/>
+          <w:color w:val="333333"/>
+          <w:sz w:val="20"/>
+        </w:rPr>
+        <w:t>FAILED_PRECONDITION</w:t>
+      </w:r>
+      <w:r>
+        <w:t xml:space="preserve"> crash, and the 187 ms recovery after the index deploy.</w:t>
       </w:r>
     </w:p>
     <w:p>
@@ -2493,7 +2487,7 @@
         <w:rPr>
           <w:i/>
         </w:rPr>
-        <w:t xml:space="preserve"> running in a side terminal — and the smoking gun was right there: </w:t>
+        <w:t xml:space="preserve"> running in a side terminal — and the smoking gun was right there. That's the first line on screen. </w:t>
       </w:r>
       <w:r>
         <w:rPr>
@@ -2508,7 +2502,22 @@
         <w:rPr>
           <w:i/>
         </w:rPr>
-        <w:t xml:space="preserve">. I added the composite index to </w:t>
+        <w:t>.</w:t>
+      </w:r>
+    </w:p>
+    <w:p>
+      <w:pPr>
+        <w:spacing w:before="40" w:after="80"/>
+        <w:ind w:left="360"/>
+        <w:pBdr>
+          <w:left w:val="single" w:sz="12" w:space="8" w:color="5B6CB7"/>
+        </w:pBdr>
+      </w:pPr>
+      <w:r>
+        <w:rPr>
+          <w:i/>
+        </w:rPr>
+        <w:t xml:space="preserve">I added the composite index to </w:t>
       </w:r>
       <w:r>
         <w:rPr>
@@ -2523,7 +2532,7 @@
         <w:rPr>
           <w:i/>
         </w:rPr>
-        <w:t xml:space="preserve">, redeployed, and first emission dropped to sub-200 milliseconds. A near-identical bug recurred for the queue listener once Phase 3 added the </w:t>
+        <w:t xml:space="preserve">, redeployed, and the second line on screen is what came back: 187 milliseconds. A near-identical bug recurred for the queue listener once Phase 3 added the </w:t>
       </w:r>
       <w:r>
         <w:rPr>
@@ -2538,7 +2547,7 @@
         <w:rPr>
           <w:i/>
         </w:rPr>
-        <w:t xml:space="preserve"> filter; the same playbook resolved it.</w:t>
+        <w:t xml:space="preserve"> filter — same playbook resolved it.</w:t>
       </w:r>
     </w:p>
     <w:p>
@@ -2598,7 +2607,7 @@
         <w:t>On screen.</w:t>
       </w:r>
       <w:r>
-        <w:t xml:space="preserve"> Live screen capture of the SuggestionsCard with one expanded "why?" panel showing factors: Mood match +0.62, Genre overlap +0.31, Variety -0.18, Recency 0.</w:t>
+        <w:t xml:space="preserve"> The four scoring factors the recommender uses, plus a real screen capture of the SuggestionsCard with one expanded "why?" panel showing factors: Mood match +0.62, Genre overlap +0.31, Variety -0.18, Recency 0.</w:t>
       </w:r>
     </w:p>
     <w:p>
@@ -2621,7 +2630,22 @@
         <w:rPr>
           <w:i/>
         </w:rPr>
-        <w:t>The AI must-solve helper is a transparent rule-based recommender. It scores tracks by mood match against the queue's current mood, genre overlap against members' favourites, variety penalty if the same artist already dominates the queue, and a recency penalty if the track was played recently. Every recommendation is shipped with its full factor breakdown so the user can see exactly why it ranked where it did. There is no machine-learned model — that's intentional, because the rubric calls out responsible AI and explainability.</w:t>
+        <w:t>The AI must-solve helper is a transparent rule-based recommender. The four bullets on screen are the entire model: it scores tracks by mood match against the queue's current mood, genre overlap against members' favourites, variety penalty if the same artist already dominates the queue, and a recency penalty if the track was played recently.</w:t>
+      </w:r>
+    </w:p>
+    <w:p>
+      <w:pPr>
+        <w:spacing w:before="40" w:after="80"/>
+        <w:ind w:left="360"/>
+        <w:pBdr>
+          <w:left w:val="single" w:sz="12" w:space="8" w:color="5B6CB7"/>
+        </w:pBdr>
+      </w:pPr>
+      <w:r>
+        <w:rPr>
+          <w:i/>
+        </w:rPr>
+        <w:t>The screenshot on the right is the most important part of this slide. Every recommendation is shipped with that "why?" expander showing the per-factor breakdown — the user can see exactly why a track ranked where it did. There is no machine-learned model. That's intentional, because the rubric calls out responsible AI and explainability.</w:t>
       </w:r>
     </w:p>
     <w:p>
@@ -2699,7 +2723,29 @@
         <w:t>On screen.</w:t>
       </w:r>
       <w:r>
-        <w:t xml:space="preserve"> Three blocks:</w:t>
+        <w:t xml:space="preserve"> Two real terminal blocks: the </w:t>
+      </w:r>
+      <w:r>
+        <w:rPr>
+          <w:rFonts w:ascii="Consolas" w:hAnsi="Consolas"/>
+          <w:color w:val="333333"/>
+          <w:sz w:val="20"/>
+        </w:rPr>
+        <w:t>flutter test</w:t>
+      </w:r>
+      <w:r>
+        <w:t xml:space="preserve"> pass line and the contents of the </w:t>
+      </w:r>
+      <w:r>
+        <w:rPr>
+          <w:rFonts w:ascii="Consolas" w:hAnsi="Consolas"/>
+          <w:color w:val="333333"/>
+          <w:sz w:val="20"/>
+        </w:rPr>
+        <w:t>submission/</w:t>
+      </w:r>
+      <w:r>
+        <w:t xml:space="preserve"> folder.</w:t>
       </w:r>
     </w:p>
     <w:p>
@@ -2718,7 +2764,7 @@
         </w:rPr>
         <w:t>$ flutter test</w:t>
         <w:br/>
-        <w:t>00:05 +62: All tests passed!</w:t>
+        <w:t>00:02 +63: All tests passed!</w:t>
       </w:r>
     </w:p>
     <w:p>
@@ -2737,7 +2783,7 @@
         </w:rPr>
         <w:t>submission/</w:t>
         <w:br/>
-        <w:t xml:space="preserve">  BUG_LOG.md            (six bugs, root-cause format)</w:t>
+        <w:t xml:space="preserve">  BUG_LOG.md            (seven bugs, root-cause format)</w:t>
         <w:br/>
         <w:t xml:space="preserve">  CURATED_QUESTIONS.md  (14 questions, full answers)</w:t>
         <w:br/>
@@ -2766,7 +2812,7 @@
         <w:rPr>
           <w:i/>
         </w:rPr>
-        <w:t>Sixty-two tests, all green: nine test files covering the recommender, the fairness ranker, the queue voting transaction, the session lifecycle, the Spotify repository fallback contract, the auth error mapping, the chat repo, the mood summary, and theme rendering.</w:t>
+        <w:t>The first block on screen is the test suite — sixty-three cases, all green. Nine test files covering the recommender, the fairness ranker, the queue voting transaction, the session lifecycle, the Spotify repository fallback contract, the auth error mapping, the chat repo, the mood summary, and theme rendering.</w:t>
       </w:r>
     </w:p>
     <w:p>
@@ -2781,22 +2827,7 @@
         <w:rPr>
           <w:i/>
         </w:rPr>
-        <w:t xml:space="preserve">Everything the grader needs lives in </w:t>
-      </w:r>
-      <w:r>
-        <w:rPr>
-          <w:rFonts w:ascii="Consolas" w:hAnsi="Consolas"/>
-          <w:i/>
-          <w:color w:val="333333"/>
-          <w:sz w:val="20"/>
-        </w:rPr>
-        <w:t>submission/</w:t>
-      </w:r>
-      <w:r>
-        <w:rPr>
-          <w:i/>
-        </w:rPr>
-        <w:t>. The bug log is the diary of the six hardest fixes — issue, root cause, fix, files touched, commit hash. The curated questions Markdown is the answer key for the fourteen I selected. The release APK is signed and ready to sideload.</w:t>
+        <w:t>The second block is everything the grader needs in one folder. The bug log is the diary of the seven hardest fixes — issue, root cause, fix, files touched, commit hash. The curated questions Markdown is the answer key for the fourteen I selected; the same content is also in a Word document for the rubric. The release APK is signed and ready to sideload onto any Android phone.</w:t>
       </w:r>
     </w:p>
     <w:p>
@@ -2877,7 +2908,7 @@
         <w:rPr>
           <w:i/>
         </w:rPr>
-        <w:t>If I restarted tomorrow on the same Flutter and Firebase substrate, two things would change.</w:t>
+        <w:t>If I restarted tomorrow on the same Flutter and Firebase substrate, the two numbered points on screen are what would change.</w:t>
       </w:r>
     </w:p>
     <w:p>
@@ -2892,7 +2923,7 @@
         <w:rPr>
           <w:i/>
         </w:rPr>
-        <w:t>One, the Firebase emulator suite would be in the repo from day one. Security-rule changes today are caught at runtime; with the emulator suite they would be unit-tested.</w:t>
+        <w:t>One — the Firebase emulator suite would be in the repo from day one. Security-rule changes today are caught at runtime, which is how I found Bug 2 and Bug 7 the painful way; with the emulator suite they would be unit-tested.</w:t>
       </w:r>
     </w:p>
     <w:p>
@@ -2907,7 +2938,7 @@
         <w:rPr>
           <w:i/>
         </w:rPr>
-        <w:t>Two, every mutation would go through a Cloud Function with the Admin SDK rather than directly from the client to Firestore. That collapses the rule surface to "client can read what it owns; only Functions can write." The blast radius for any future schema mistake is much smaller, and the rule file itself becomes a handful of read-only allow lines.</w:t>
+        <w:t>Two — every mutation would go through a Cloud Function with the Admin SDK rather than directly from the client to Firestore. That collapses the rule surface to "client can read what it owns; only Functions can write." The blast radius for any future schema mistake is much smaller, and the rule file itself becomes a handful of read-only allow lines.</w:t>
       </w:r>
     </w:p>
     <w:p>
@@ -2934,7 +2965,7 @@
         <w:t>On screen.</w:t>
       </w:r>
       <w:r>
-        <w:t xml:space="preserve"> "Vibzcheck — github.com/Tmaku18/vibzcheck-project2" plus a QR code if you want to add one.</w:t>
+        <w:t xml:space="preserve"> "Vibzcheck — github.com/Tmaku18/vibzcheck-project2" plus the high-level pitch in one paragraph.</w:t>
       </w:r>
     </w:p>
     <w:p>
@@ -2957,7 +2988,7 @@
         <w:rPr>
           <w:i/>
         </w:rPr>
-        <w:t>That's Vibzcheck. Solo build, all five required Firebase services live, transparent AI helper, graduate-level fairness ranking, and a tested-end-to-end real-time collaborative queue. The repo is public, the APK is signed, and I'm happy to take questions.</w:t>
+        <w:t>That's Vibzcheck. Solo build, all five required Firebase services live, transparent AI helper, graduate-level fairness ranking, and a real-time collaborative queue tested end to end. The repo is public, the APK is signed, and I'm happy to take questions.</w:t>
       </w:r>
     </w:p>
     <w:p>
@@ -3414,7 +3445,7 @@
         <w:t>flutter test</w:t>
       </w:r>
       <w:r>
-        <w:t xml:space="preserve"> once on the projector → 62 passes line is visible.</w:t>
+        <w:t xml:space="preserve"> once on the projector → 63 passes line is visible.</w:t>
       </w:r>
     </w:p>
     <w:p>

</xml_diff>